<commit_message>
Proposals: 5-day report turnaround, sector focus, Ready7-only comparison, AI market context
- Strategy proposal: sector focus (value at stake), 240-entry library slide, illustrative
  retail-bank output, day-by-day 5-day plan; GT position uses actual AI Ready7 results only
- Readiness proposal: market context from GT 'Introduction to AI' session (shift, what AI
  unlocks, adoption maturity curve, adoption outpacing governance), new domains, 5-day timeline,
  GT's own Ready7 results by pillar and domain (no sample-vs-Ready7 comparison)
- Ops guide: 5-working-day service commitment; README updated

Co-Authored-By: Claude Opus 5.5 <noreply@anthropic.com>
Claude-Session: https://claude.ai/code/session_01X8ossW6xvKTGEs2GV44CxS
</commit_message>
<xml_diff>
--- a/01_AI_Governance_Risk_Compliance/1.3_AI_Readiness_Assessment_Tool/GT_INTERNAL_Readiness_Assessment_Operating_Guide.docx
+++ b/01_AI_Governance_Risk_Compliance/1.3_AI_Readiness_Assessment_Tool/GT_INTERNAL_Readiness_Assessment_Operating_Guide.docx
@@ -62,6 +62,24 @@
           <w:color w:val="4F2D7F"/>
         </w:rPr>
         <w:t>1. How the process works</w:t>
+      </w:r>
+    </w:p>
+    <w:p>
+      <w:pPr>
+        <w:spacing w:after="80"/>
+      </w:pPr>
+      <w:r>
+        <w:rPr>
+          <w:b/>
+          <w:sz w:val="20"/>
+        </w:rPr>
+        <w:t xml:space="preserve">Service commitment - report within 5 working days: </w:t>
+      </w:r>
+      <w:r>
+        <w:rPr>
+          <w:sz w:val="20"/>
+        </w:rPr>
+        <w:t>Day 1 kick-off and questionnaire link; client completes by Day 2; GT analysis and quality review on Days 3-4; report issued and debrief on Day 5. If responses arrive late, the report is still issued within 3 working days of receiving complete responses.</w:t>
       </w:r>
     </w:p>
     <w:tbl>
@@ -142,7 +160,7 @@
                 <w:color w:val="FFFFFF"/>
                 <w:sz w:val="18"/>
               </w:rPr>
-              <w:t>Time</w:t>
+              <w:t>Day</w:t>
             </w:r>
           </w:p>
         </w:tc>
@@ -200,7 +218,7 @@
               <w:rPr>
                 <w:sz w:val="18"/>
               </w:rPr>
-              <w:t>15 min</w:t>
+              <w:t>Day 1</w:t>
             </w:r>
           </w:p>
         </w:tc>
@@ -258,7 +276,7 @@
               <w:rPr>
                 <w:sz w:val="18"/>
               </w:rPr>
-              <w:t>~45 min</w:t>
+              <w:t>Day 1-2 (~45 min)</w:t>
             </w:r>
           </w:p>
         </w:tc>
@@ -316,7 +334,7 @@
               <w:rPr>
                 <w:sz w:val="18"/>
               </w:rPr>
-              <w:t>2 min</w:t>
+              <w:t>Day 3</w:t>
             </w:r>
           </w:p>
         </w:tc>
@@ -374,7 +392,7 @@
               <w:rPr>
                 <w:sz w:val="18"/>
               </w:rPr>
-              <w:t>2-5 min</w:t>
+              <w:t>Day 3</w:t>
             </w:r>
           </w:p>
         </w:tc>
@@ -432,7 +450,7 @@
               <w:rPr>
                 <w:sz w:val="18"/>
               </w:rPr>
-              <w:t>30-60 min</w:t>
+              <w:t>Day 3-4</w:t>
             </w:r>
           </w:p>
         </w:tc>
@@ -490,7 +508,7 @@
               <w:rPr>
                 <w:sz w:val="18"/>
               </w:rPr>
-              <w:t>5 min</w:t>
+              <w:t>Day 5</w:t>
             </w:r>
           </w:p>
         </w:tc>
@@ -548,7 +566,7 @@
               <w:rPr>
                 <w:sz w:val="18"/>
               </w:rPr>
-              <w:t>60-90 min</w:t>
+              <w:t>Day 5</w:t>
             </w:r>
           </w:p>
         </w:tc>

</xml_diff>

<commit_message>
Readiness tool: position on the AI adoption maturity curve; user's updated readiness proposal
- Report executive summary shows the five-stage AI adoption maturity curve with the adoption stage
  (from A1) and the governance-supported stage (from overall readiness), and flags when adoption is
  ahead of governance; curve position added to the email draft
- Domain table and radar chart kept on one page
- Readiness proposal: user's updated version, with refreshed report screenshots and corrected
  source lines (McKinsey / IDC; JPMorgan Chase disclosures)
- Sample report, sample engine, ops guide and README updated

Co-Authored-By: Claude Opus 5.5 <noreply@anthropic.com>
Claude-Session: https://claude.ai/code/session_01X8ossW6xvKTGEs2GV44CxS
</commit_message>
<xml_diff>
--- a/01_AI_Governance_Risk_Compliance/1.3_AI_Readiness_Assessment_Tool/GT_INTERNAL_Readiness_Assessment_Operating_Guide.docx
+++ b/01_AI_Governance_Risk_Compliance/1.3_AI_Readiness_Assessment_Tool/GT_INTERNAL_Readiness_Assessment_Operating_Guide.docx
@@ -1149,6 +1149,15 @@
         <w:spacing w:after="40"/>
       </w:pPr>
       <w:r>
+        <w:t>AI adoption maturity curve: the adoption stage follows the client's AI-use answer (A1) and the governance stage follows overall readiness - check both are plausible and that any 'adoption ahead of governance' message is reflected in the debrief.</w:t>
+      </w:r>
+    </w:p>
+    <w:p>
+      <w:pPr>
+        <w:pStyle w:val="ListBullet"/>
+        <w:spacing w:after="40"/>
+      </w:pPr>
+      <w:r>
         <w:t>Read the narrative, the top-5 priorities and the roadmap; amend in the engine copy and re-export if a professional judgement differs - record the change in the engagement file.</w:t>
       </w:r>
     </w:p>

</xml_diff>

<commit_message>
Readiness proposal: three engagement durations with Gantt timelines; strategy formulation slide
- Readiness: Essential 5 working days, Standard 2 weeks, Plus 6 weeks (extendable to 8) with a
  Gantt timeline slide per option; Plus scope covers AI-system deep dives; related slides aligned
- Strategy: 'How We Formulate Your AI Strategy' (6 steps, client input and outputs, strategy on a
  page); client self-assessment portal removed from GT tools list
- src/update_proposals.py applies these in place to the user-edited decks; ops guide and README updated

Co-Authored-By: Claude Opus 5.5 <noreply@anthropic.com>
Claude-Session: https://claude.ai/code/session_01X8ossW6xvKTGEs2GV44CxS
</commit_message>
<xml_diff>
--- a/01_AI_Governance_Risk_Compliance/1.3_AI_Readiness_Assessment_Tool/GT_INTERNAL_Readiness_Assessment_Operating_Guide.docx
+++ b/01_AI_Governance_Risk_Compliance/1.3_AI_Readiness_Assessment_Tool/GT_INTERNAL_Readiness_Assessment_Operating_Guide.docx
@@ -73,13 +73,13 @@
           <w:b/>
           <w:sz w:val="20"/>
         </w:rPr>
-        <w:t xml:space="preserve">Service commitment - report within 5 working days: </w:t>
+        <w:t xml:space="preserve">Service commitment by option: </w:t>
       </w:r>
       <w:r>
         <w:rPr>
           <w:sz w:val="20"/>
         </w:rPr>
-        <w:t>Day 1 kick-off and questionnaire link; client completes by Day 2; GT analysis and quality review on Days 3-4; report issued and debrief on Day 5. If responses arrive late, the report is still issued within 3 working days of receiving complete responses.</w:t>
+        <w:t>Essential - report within 5 working days (Day 1 kick-off; questionnaire by Day 2; GT analysis Days 3-4; report Day 5). Standard - 2 weeks (multi-respondent questionnaire, evidence review and validation interviews in week 1-2; report and leadership debrief end of week 2). Plus - 6 weeks, extendable to 8 (readiness report week 2; AI inventory, risk &amp; impact assessments, control review, ISO/IEC 42001 gap and AI security review; final report and board presentation week 6). If responses arrive late, the report is issued within 3 working days of complete responses.</w:t>
       </w:r>
     </w:p>
     <w:tbl>

</xml_diff>